<commit_message>
docs: update report with new figures and export formats
</commit_message>
<xml_diff>
--- a/docs/report.docx
+++ b/docs/report.docx
@@ -8753,329 +8753,910 @@
         <w:t xml:space="preserve">Sepolia, simulated shots run the consensus tooling):</w:t>
       </w:r>
     </w:p>
-    <w:tbl>
-      <w:tblPr>
-        <w:tblStyle w:val="Table"/>
-        <w:tblW w:type="pct" w:w="5000"/>
-        <w:tblLayout w:type="fixed"/>
-        <w:tblLook w:firstRow="1" w:lastRow="0" w:firstColumn="0" w:lastColumn="0" w:noHBand="0" w:noVBand="0" w:val="0020"/>
-      </w:tblPr>
-      <w:tblGrid>
-        <w:gridCol w:w="3960"/>
-        <w:gridCol w:w="3960"/>
-      </w:tblGrid>
-      <w:tr>
-        <w:trPr>
-          <w:tblHeader w:val="on"/>
-        </w:trPr>
-        <w:tc>
-          <w:tcPr/>
-          <w:p>
-            <w:pPr>
-              <w:pStyle w:val="Compact"/>
-            </w:pPr>
-            <w:r>
-              <w:t xml:space="preserve">File</w:t>
-            </w:r>
-          </w:p>
-        </w:tc>
-        <w:tc>
-          <w:tcPr/>
-          <w:p>
-            <w:pPr>
-              <w:pStyle w:val="Compact"/>
-            </w:pPr>
-            <w:r>
-              <w:t xml:space="preserve">Caption</w:t>
-            </w:r>
-          </w:p>
-        </w:tc>
-      </w:tr>
-      <w:tr>
-        <w:tc>
-          <w:tcPr/>
-          <w:p>
-            <w:pPr>
-              <w:pStyle w:val="Compact"/>
-            </w:pPr>
-            <w:r>
-              <w:rPr>
-                <w:rStyle w:val="VerbatimChar"/>
-              </w:rPr>
-              <w:t xml:space="preserve">01-sign-in.png</w:t>
-            </w:r>
-          </w:p>
-        </w:tc>
-        <w:tc>
-          <w:tcPr/>
-          <w:p>
-            <w:pPr>
-              <w:pStyle w:val="Compact"/>
-            </w:pPr>
-            <w:r>
-              <w:t xml:space="preserve">Sign-in page with the demo-credentials panel</w:t>
-            </w:r>
-          </w:p>
-        </w:tc>
-      </w:tr>
-      <w:tr>
-        <w:tc>
-          <w:tcPr/>
-          <w:p>
-            <w:pPr>
-              <w:pStyle w:val="Compact"/>
-            </w:pPr>
-            <w:r>
-              <w:rPr>
-                <w:rStyle w:val="VerbatimChar"/>
-              </w:rPr>
-              <w:t xml:space="preserve">02-farmer-dashboard.png</w:t>
-            </w:r>
-          </w:p>
-        </w:tc>
-        <w:tc>
-          <w:tcPr/>
-          <w:p>
-            <w:pPr>
-              <w:pStyle w:val="Compact"/>
-            </w:pPr>
-            <w:r>
-              <w:t xml:space="preserve">Farmer dashboard (simulated data mode)</w:t>
-            </w:r>
-          </w:p>
-        </w:tc>
-      </w:tr>
-      <w:tr>
-        <w:tc>
-          <w:tcPr/>
-          <w:p>
-            <w:pPr>
-              <w:pStyle w:val="Compact"/>
-            </w:pPr>
-            <w:r>
-              <w:rPr>
-                <w:rStyle w:val="VerbatimChar"/>
-              </w:rPr>
-              <w:t xml:space="preserve">03-buy-cover.png</w:t>
-            </w:r>
-          </w:p>
-        </w:tc>
-        <w:tc>
-          <w:tcPr/>
-          <w:p>
-            <w:pPr>
-              <w:pStyle w:val="Compact"/>
-            </w:pPr>
-            <w:r>
-              <w:t xml:space="preserve">Buy cover: window, threshold and payout selection</w:t>
-            </w:r>
-          </w:p>
-        </w:tc>
-      </w:tr>
-      <w:tr>
-        <w:tc>
-          <w:tcPr/>
-          <w:p>
-            <w:pPr>
-              <w:pStyle w:val="Compact"/>
-            </w:pPr>
-            <w:r>
-              <w:rPr>
-                <w:rStyle w:val="VerbatimChar"/>
-              </w:rPr>
-              <w:t xml:space="preserve">04-policy-detail.png</w:t>
-            </w:r>
-          </w:p>
-        </w:tc>
-        <w:tc>
-          <w:tcPr/>
-          <w:p>
-            <w:pPr>
-              <w:pStyle w:val="Compact"/>
-            </w:pPr>
-            <w:r>
-              <w:t xml:space="preserve">Policy #0 — bought 29 Oct 2026, settled and paid out; oracle evaluation and settlement transaction</w:t>
-            </w:r>
-          </w:p>
-        </w:tc>
-      </w:tr>
-      <w:tr>
-        <w:tc>
-          <w:tcPr/>
-          <w:p>
-            <w:pPr>
-              <w:pStyle w:val="Compact"/>
-            </w:pPr>
-            <w:r>
-              <w:rPr>
-                <w:rStyle w:val="VerbatimChar"/>
-              </w:rPr>
-              <w:t xml:space="preserve">05-admin-overview.png</w:t>
-            </w:r>
-          </w:p>
-        </w:tc>
-        <w:tc>
-          <w:tcPr/>
-          <w:p>
-            <w:pPr>
-              <w:pStyle w:val="Compact"/>
-            </w:pPr>
-            <w:r>
-              <w:t xml:space="preserve">Administrator overview</w:t>
-            </w:r>
-          </w:p>
-        </w:tc>
-      </w:tr>
-      <w:tr>
-        <w:tc>
-          <w:tcPr/>
-          <w:p>
-            <w:pPr>
-              <w:pStyle w:val="Compact"/>
-            </w:pPr>
-            <w:r>
-              <w:rPr>
-                <w:rStyle w:val="VerbatimChar"/>
-              </w:rPr>
-              <w:t xml:space="preserve">06-oracle-sources.png</w:t>
-            </w:r>
-          </w:p>
-        </w:tc>
-        <w:tc>
-          <w:tcPr/>
-          <w:p>
-            <w:pPr>
-              <w:pStyle w:val="Compact"/>
-            </w:pPr>
-            <w:r>
-              <w:t xml:space="preserve">Oracle sources and reputation weights</w:t>
-            </w:r>
-          </w:p>
-        </w:tc>
-      </w:tr>
-      <w:tr>
-        <w:tc>
-          <w:tcPr/>
-          <w:p>
-            <w:pPr>
-              <w:pStyle w:val="Compact"/>
-            </w:pPr>
-            <w:r>
-              <w:rPr>
-                <w:rStyle w:val="VerbatimChar"/>
-              </w:rPr>
-              <w:t xml:space="preserve">07-consensus-simulator.png</w:t>
-            </w:r>
-          </w:p>
-        </w:tc>
-        <w:tc>
-          <w:tcPr/>
-          <w:p>
-            <w:pPr>
-              <w:pStyle w:val="Compact"/>
-            </w:pPr>
-            <w:r>
-              <w:t xml:space="preserve">Consensus simulator with one source corrupted (NASA POWER inflated ×2.5)</w:t>
-            </w:r>
-          </w:p>
-        </w:tc>
-      </w:tr>
-      <w:tr>
-        <w:tc>
-          <w:tcPr/>
-          <w:p>
-            <w:pPr>
-              <w:pStyle w:val="Compact"/>
-            </w:pPr>
-            <w:r>
-              <w:rPr>
-                <w:rStyle w:val="VerbatimChar"/>
-              </w:rPr>
-              <w:t xml:space="preserve">08-backtest.png</w:t>
-            </w:r>
-          </w:p>
-        </w:tc>
-        <w:tc>
-          <w:tcPr/>
-          <w:p>
-            <w:pPr>
-              <w:pStyle w:val="Compact"/>
-            </w:pPr>
-            <w:r>
-              <w:t xml:space="preserve">Backtest of aggregation designs against historical rainfall</w:t>
-            </w:r>
-          </w:p>
-        </w:tc>
-      </w:tr>
-      <w:tr>
-        <w:tc>
-          <w:tcPr/>
-          <w:p>
-            <w:pPr>
-              <w:pStyle w:val="Compact"/>
-            </w:pPr>
-            <w:r>
-              <w:rPr>
-                <w:rStyle w:val="VerbatimChar"/>
-              </w:rPr>
-              <w:t xml:space="preserve">09-mobile.png</w:t>
-            </w:r>
-          </w:p>
-        </w:tc>
-        <w:tc>
-          <w:tcPr/>
-          <w:p>
-            <w:pPr>
-              <w:pStyle w:val="Compact"/>
-            </w:pPr>
-            <w:r>
-              <w:t xml:space="preserve">Mobile layout of the farmer dashboard</w:t>
-            </w:r>
-          </w:p>
-        </w:tc>
-      </w:tr>
-      <w:tr>
-        <w:tc>
-          <w:tcPr/>
-          <w:p>
-            <w:pPr>
-              <w:pStyle w:val="Compact"/>
-            </w:pPr>
-            <w:r>
-              <w:rPr>
-                <w:rStyle w:val="VerbatimChar"/>
-              </w:rPr>
-              <w:t xml:space="preserve">10-tests.png</w:t>
-            </w:r>
-          </w:p>
-        </w:tc>
-        <w:tc>
-          <w:tcPr/>
-          <w:p>
-            <w:pPr>
-              <w:pStyle w:val="Compact"/>
-            </w:pPr>
-            <w:r>
-              <w:rPr>
-                <w:rStyle w:val="VerbatimChar"/>
-              </w:rPr>
-              <w:t xml:space="preserve">npm run test</w:t>
-            </w:r>
-            <w:r>
-              <w:t xml:space="preserve"> </w:t>
-            </w:r>
-            <w:r>
-              <w:t xml:space="preserve">— 69 passing (56 Solidity, 13 Mocha) in the blockchain workspace</w:t>
-            </w:r>
-          </w:p>
-        </w:tc>
-      </w:tr>
-    </w:tbl>
+    <w:p>
+      <w:r>
+        <w:br w:type="page"/>
+      </w:r>
+    </w:p>
+    <w:p>
+      <w:pPr>
+        <w:pStyle w:val="CaptionedFigure"/>
+      </w:pPr>
+      <w:r>
+        <w:drawing>
+          <wp:inline>
+            <wp:extent cx="5334000" cy="3335866"/>
+            <wp:effectExtent b="0" l="0" r="0" t="0"/>
+            <wp:docPr descr="Figure A.1" title="" id="76" name="Picture"/>
+            <a:graphic>
+              <a:graphicData uri="http://schemas.openxmlformats.org/drawingml/2006/picture">
+                <pic:pic>
+                  <pic:nvPicPr>
+                    <pic:cNvPr descr="screenshots/01-sign-in.png" id="77" name="Picture"/>
+                    <pic:cNvPicPr>
+                      <a:picLocks noChangeArrowheads="1" noChangeAspect="1"/>
+                    </pic:cNvPicPr>
+                  </pic:nvPicPr>
+                  <pic:blipFill>
+                    <a:blip r:embed="rId75"/>
+                    <a:stretch>
+                      <a:fillRect/>
+                    </a:stretch>
+                  </pic:blipFill>
+                  <pic:spPr bwMode="auto">
+                    <a:xfrm>
+                      <a:off x="0" y="0"/>
+                      <a:ext cx="5334000" cy="3335866"/>
+                    </a:xfrm>
+                    <a:prstGeom prst="rect">
+                      <a:avLst/>
+                    </a:prstGeom>
+                    <a:noFill/>
+                    <a:ln w="9525">
+                      <a:noFill/>
+                      <a:headEnd/>
+                      <a:tailEnd/>
+                    </a:ln>
+                  </pic:spPr>
+                </pic:pic>
+              </a:graphicData>
+            </a:graphic>
+          </wp:inline>
+        </w:drawing>
+      </w:r>
+    </w:p>
+    <w:p>
+      <w:pPr>
+        <w:pStyle w:val="ImageCaption"/>
+      </w:pPr>
+      <w:r>
+        <w:t xml:space="preserve">Figure A.1</w:t>
+      </w:r>
+    </w:p>
     <w:p>
       <w:pPr>
         <w:pStyle w:val="FirstParagraph"/>
       </w:pPr>
       <w:r>
+        <w:rPr>
+          <w:i/>
+          <w:iCs/>
+        </w:rPr>
+        <w:t xml:space="preserve">Figure A.1 — Sign-in page with the demo-credentials panel (</w:t>
+      </w:r>
+      <w:r>
+        <w:rPr>
+          <w:rStyle w:val="VerbatimChar"/>
+          <w:i/>
+          <w:iCs/>
+        </w:rPr>
+        <w:t xml:space="preserve">01-sign-in.png</w:t>
+      </w:r>
+      <w:r>
+        <w:rPr>
+          <w:i/>
+          <w:iCs/>
+        </w:rPr>
+        <w:t xml:space="preserve">)</w:t>
+      </w:r>
+    </w:p>
+    <w:p>
+      <w:r>
+        <w:br w:type="page"/>
+      </w:r>
+    </w:p>
+    <w:p>
+      <w:pPr>
+        <w:pStyle w:val="CaptionedFigure"/>
+      </w:pPr>
+      <w:r>
+        <w:drawing>
+          <wp:inline>
+            <wp:extent cx="5334000" cy="3903133"/>
+            <wp:effectExtent b="0" l="0" r="0" t="0"/>
+            <wp:docPr descr="Figure A.2" title="" id="79" name="Picture"/>
+            <a:graphic>
+              <a:graphicData uri="http://schemas.openxmlformats.org/drawingml/2006/picture">
+                <pic:pic>
+                  <pic:nvPicPr>
+                    <pic:cNvPr descr="screenshots/02-farmer-dashboard.png" id="80" name="Picture"/>
+                    <pic:cNvPicPr>
+                      <a:picLocks noChangeArrowheads="1" noChangeAspect="1"/>
+                    </pic:cNvPicPr>
+                  </pic:nvPicPr>
+                  <pic:blipFill>
+                    <a:blip r:embed="rId78"/>
+                    <a:stretch>
+                      <a:fillRect/>
+                    </a:stretch>
+                  </pic:blipFill>
+                  <pic:spPr bwMode="auto">
+                    <a:xfrm>
+                      <a:off x="0" y="0"/>
+                      <a:ext cx="5334000" cy="3903133"/>
+                    </a:xfrm>
+                    <a:prstGeom prst="rect">
+                      <a:avLst/>
+                    </a:prstGeom>
+                    <a:noFill/>
+                    <a:ln w="9525">
+                      <a:noFill/>
+                      <a:headEnd/>
+                      <a:tailEnd/>
+                    </a:ln>
+                  </pic:spPr>
+                </pic:pic>
+              </a:graphicData>
+            </a:graphic>
+          </wp:inline>
+        </w:drawing>
+      </w:r>
+    </w:p>
+    <w:p>
+      <w:pPr>
+        <w:pStyle w:val="ImageCaption"/>
+      </w:pPr>
+      <w:r>
+        <w:t xml:space="preserve">Figure A.2</w:t>
+      </w:r>
+    </w:p>
+    <w:p>
+      <w:pPr>
+        <w:pStyle w:val="FirstParagraph"/>
+      </w:pPr>
+      <w:r>
+        <w:rPr>
+          <w:i/>
+          <w:iCs/>
+        </w:rPr>
+        <w:t xml:space="preserve">Figure A.2 — Farmer dashboard (simulated data mode) (</w:t>
+      </w:r>
+      <w:r>
+        <w:rPr>
+          <w:rStyle w:val="VerbatimChar"/>
+          <w:i/>
+          <w:iCs/>
+        </w:rPr>
+        <w:t xml:space="preserve">02-farmer-dashboard.png</w:t>
+      </w:r>
+      <w:r>
+        <w:rPr>
+          <w:i/>
+          <w:iCs/>
+        </w:rPr>
+        <w:t xml:space="preserve">)</w:t>
+      </w:r>
+    </w:p>
+    <w:p>
+      <w:r>
+        <w:br w:type="page"/>
+      </w:r>
+    </w:p>
+    <w:p>
+      <w:pPr>
+        <w:pStyle w:val="CaptionedFigure"/>
+      </w:pPr>
+      <w:r>
+        <w:drawing>
+          <wp:inline>
+            <wp:extent cx="5334000" cy="5003800"/>
+            <wp:effectExtent b="0" l="0" r="0" t="0"/>
+            <wp:docPr descr="Figure A.3" title="" id="82" name="Picture"/>
+            <a:graphic>
+              <a:graphicData uri="http://schemas.openxmlformats.org/drawingml/2006/picture">
+                <pic:pic>
+                  <pic:nvPicPr>
+                    <pic:cNvPr descr="screenshots/03-buy-cover.png" id="83" name="Picture"/>
+                    <pic:cNvPicPr>
+                      <a:picLocks noChangeArrowheads="1" noChangeAspect="1"/>
+                    </pic:cNvPicPr>
+                  </pic:nvPicPr>
+                  <pic:blipFill>
+                    <a:blip r:embed="rId81"/>
+                    <a:stretch>
+                      <a:fillRect/>
+                    </a:stretch>
+                  </pic:blipFill>
+                  <pic:spPr bwMode="auto">
+                    <a:xfrm>
+                      <a:off x="0" y="0"/>
+                      <a:ext cx="5334000" cy="5003800"/>
+                    </a:xfrm>
+                    <a:prstGeom prst="rect">
+                      <a:avLst/>
+                    </a:prstGeom>
+                    <a:noFill/>
+                    <a:ln w="9525">
+                      <a:noFill/>
+                      <a:headEnd/>
+                      <a:tailEnd/>
+                    </a:ln>
+                  </pic:spPr>
+                </pic:pic>
+              </a:graphicData>
+            </a:graphic>
+          </wp:inline>
+        </w:drawing>
+      </w:r>
+    </w:p>
+    <w:p>
+      <w:pPr>
+        <w:pStyle w:val="ImageCaption"/>
+      </w:pPr>
+      <w:r>
+        <w:t xml:space="preserve">Figure A.3</w:t>
+      </w:r>
+    </w:p>
+    <w:p>
+      <w:pPr>
+        <w:pStyle w:val="FirstParagraph"/>
+      </w:pPr>
+      <w:r>
+        <w:rPr>
+          <w:i/>
+          <w:iCs/>
+        </w:rPr>
+        <w:t xml:space="preserve">Figure A.3 — Buy cover: coverage window, rainfall threshold and payout selection (</w:t>
+      </w:r>
+      <w:r>
+        <w:rPr>
+          <w:rStyle w:val="VerbatimChar"/>
+          <w:i/>
+          <w:iCs/>
+        </w:rPr>
+        <w:t xml:space="preserve">03-buy-cover.png</w:t>
+      </w:r>
+      <w:r>
+        <w:rPr>
+          <w:i/>
+          <w:iCs/>
+        </w:rPr>
+        <w:t xml:space="preserve">)</w:t>
+      </w:r>
+    </w:p>
+    <w:p>
+      <w:r>
+        <w:br w:type="page"/>
+      </w:r>
+    </w:p>
+    <w:p>
+      <w:pPr>
+        <w:pStyle w:val="CaptionedFigure"/>
+      </w:pPr>
+      <w:r>
+        <w:drawing>
+          <wp:inline>
+            <wp:extent cx="5334000" cy="4707466"/>
+            <wp:effectExtent b="0" l="0" r="0" t="0"/>
+            <wp:docPr descr="Figure A.4" title="" id="85" name="Picture"/>
+            <a:graphic>
+              <a:graphicData uri="http://schemas.openxmlformats.org/drawingml/2006/picture">
+                <pic:pic>
+                  <pic:nvPicPr>
+                    <pic:cNvPr descr="screenshots/04-policy-detail.png" id="86" name="Picture"/>
+                    <pic:cNvPicPr>
+                      <a:picLocks noChangeArrowheads="1" noChangeAspect="1"/>
+                    </pic:cNvPicPr>
+                  </pic:nvPicPr>
+                  <pic:blipFill>
+                    <a:blip r:embed="rId84"/>
+                    <a:stretch>
+                      <a:fillRect/>
+                    </a:stretch>
+                  </pic:blipFill>
+                  <pic:spPr bwMode="auto">
+                    <a:xfrm>
+                      <a:off x="0" y="0"/>
+                      <a:ext cx="5334000" cy="4707466"/>
+                    </a:xfrm>
+                    <a:prstGeom prst="rect">
+                      <a:avLst/>
+                    </a:prstGeom>
+                    <a:noFill/>
+                    <a:ln w="9525">
+                      <a:noFill/>
+                      <a:headEnd/>
+                      <a:tailEnd/>
+                    </a:ln>
+                  </pic:spPr>
+                </pic:pic>
+              </a:graphicData>
+            </a:graphic>
+          </wp:inline>
+        </w:drawing>
+      </w:r>
+    </w:p>
+    <w:p>
+      <w:pPr>
+        <w:pStyle w:val="ImageCaption"/>
+      </w:pPr>
+      <w:r>
+        <w:t xml:space="preserve">Figure A.4</w:t>
+      </w:r>
+    </w:p>
+    <w:p>
+      <w:pPr>
+        <w:pStyle w:val="FirstParagraph"/>
+      </w:pPr>
+      <w:r>
+        <w:rPr>
+          <w:i/>
+          <w:iCs/>
+        </w:rPr>
+        <w:t xml:space="preserve">Figure A.4 — Policy #0 — bought 29 Oct 2026, settled and paid out; oracle evaluation and settlement transaction (</w:t>
+      </w:r>
+      <w:r>
+        <w:rPr>
+          <w:rStyle w:val="VerbatimChar"/>
+          <w:i/>
+          <w:iCs/>
+        </w:rPr>
+        <w:t xml:space="preserve">04-policy-detail.png</w:t>
+      </w:r>
+      <w:r>
+        <w:rPr>
+          <w:i/>
+          <w:iCs/>
+        </w:rPr>
+        <w:t xml:space="preserve">)</w:t>
+      </w:r>
+    </w:p>
+    <w:p>
+      <w:r>
+        <w:br w:type="page"/>
+      </w:r>
+    </w:p>
+    <w:p>
+      <w:pPr>
+        <w:pStyle w:val="CaptionedFigure"/>
+      </w:pPr>
+      <w:r>
+        <w:drawing>
+          <wp:inline>
+            <wp:extent cx="5334000" cy="4461933"/>
+            <wp:effectExtent b="0" l="0" r="0" t="0"/>
+            <wp:docPr descr="Figure A.5" title="" id="88" name="Picture"/>
+            <a:graphic>
+              <a:graphicData uri="http://schemas.openxmlformats.org/drawingml/2006/picture">
+                <pic:pic>
+                  <pic:nvPicPr>
+                    <pic:cNvPr descr="screenshots/05-admin-overview.png" id="89" name="Picture"/>
+                    <pic:cNvPicPr>
+                      <a:picLocks noChangeArrowheads="1" noChangeAspect="1"/>
+                    </pic:cNvPicPr>
+                  </pic:nvPicPr>
+                  <pic:blipFill>
+                    <a:blip r:embed="rId87"/>
+                    <a:stretch>
+                      <a:fillRect/>
+                    </a:stretch>
+                  </pic:blipFill>
+                  <pic:spPr bwMode="auto">
+                    <a:xfrm>
+                      <a:off x="0" y="0"/>
+                      <a:ext cx="5334000" cy="4461933"/>
+                    </a:xfrm>
+                    <a:prstGeom prst="rect">
+                      <a:avLst/>
+                    </a:prstGeom>
+                    <a:noFill/>
+                    <a:ln w="9525">
+                      <a:noFill/>
+                      <a:headEnd/>
+                      <a:tailEnd/>
+                    </a:ln>
+                  </pic:spPr>
+                </pic:pic>
+              </a:graphicData>
+            </a:graphic>
+          </wp:inline>
+        </w:drawing>
+      </w:r>
+    </w:p>
+    <w:p>
+      <w:pPr>
+        <w:pStyle w:val="ImageCaption"/>
+      </w:pPr>
+      <w:r>
+        <w:t xml:space="preserve">Figure A.5</w:t>
+      </w:r>
+    </w:p>
+    <w:p>
+      <w:pPr>
+        <w:pStyle w:val="FirstParagraph"/>
+      </w:pPr>
+      <w:r>
+        <w:rPr>
+          <w:i/>
+          <w:iCs/>
+        </w:rPr>
+        <w:t xml:space="preserve">Figure A.5 — Administrator overview (</w:t>
+      </w:r>
+      <w:r>
+        <w:rPr>
+          <w:rStyle w:val="VerbatimChar"/>
+          <w:i/>
+          <w:iCs/>
+        </w:rPr>
+        <w:t xml:space="preserve">05-admin-overview.png</w:t>
+      </w:r>
+      <w:r>
+        <w:rPr>
+          <w:i/>
+          <w:iCs/>
+        </w:rPr>
+        <w:t xml:space="preserve">)</w:t>
+      </w:r>
+    </w:p>
+    <w:p>
+      <w:r>
+        <w:br w:type="page"/>
+      </w:r>
+    </w:p>
+    <w:p>
+      <w:pPr>
+        <w:pStyle w:val="CaptionedFigure"/>
+      </w:pPr>
+      <w:r>
+        <w:drawing>
+          <wp:inline>
+            <wp:extent cx="5334000" cy="6163733"/>
+            <wp:effectExtent b="0" l="0" r="0" t="0"/>
+            <wp:docPr descr="Figure A.6" title="" id="91" name="Picture"/>
+            <a:graphic>
+              <a:graphicData uri="http://schemas.openxmlformats.org/drawingml/2006/picture">
+                <pic:pic>
+                  <pic:nvPicPr>
+                    <pic:cNvPr descr="screenshots/06-oracle-sources.png" id="92" name="Picture"/>
+                    <pic:cNvPicPr>
+                      <a:picLocks noChangeArrowheads="1" noChangeAspect="1"/>
+                    </pic:cNvPicPr>
+                  </pic:nvPicPr>
+                  <pic:blipFill>
+                    <a:blip r:embed="rId90"/>
+                    <a:stretch>
+                      <a:fillRect/>
+                    </a:stretch>
+                  </pic:blipFill>
+                  <pic:spPr bwMode="auto">
+                    <a:xfrm>
+                      <a:off x="0" y="0"/>
+                      <a:ext cx="5334000" cy="6163733"/>
+                    </a:xfrm>
+                    <a:prstGeom prst="rect">
+                      <a:avLst/>
+                    </a:prstGeom>
+                    <a:noFill/>
+                    <a:ln w="9525">
+                      <a:noFill/>
+                      <a:headEnd/>
+                      <a:tailEnd/>
+                    </a:ln>
+                  </pic:spPr>
+                </pic:pic>
+              </a:graphicData>
+            </a:graphic>
+          </wp:inline>
+        </w:drawing>
+      </w:r>
+    </w:p>
+    <w:p>
+      <w:pPr>
+        <w:pStyle w:val="ImageCaption"/>
+      </w:pPr>
+      <w:r>
+        <w:t xml:space="preserve">Figure A.6</w:t>
+      </w:r>
+    </w:p>
+    <w:p>
+      <w:pPr>
+        <w:pStyle w:val="FirstParagraph"/>
+      </w:pPr>
+      <w:r>
+        <w:rPr>
+          <w:i/>
+          <w:iCs/>
+        </w:rPr>
+        <w:t xml:space="preserve">Figure A.6 — Oracle sources and reputation weights (</w:t>
+      </w:r>
+      <w:r>
+        <w:rPr>
+          <w:rStyle w:val="VerbatimChar"/>
+          <w:i/>
+          <w:iCs/>
+        </w:rPr>
+        <w:t xml:space="preserve">06-oracle-sources.png</w:t>
+      </w:r>
+      <w:r>
+        <w:rPr>
+          <w:i/>
+          <w:iCs/>
+        </w:rPr>
+        <w:t xml:space="preserve">)</w:t>
+      </w:r>
+    </w:p>
+    <w:p>
+      <w:r>
+        <w:br w:type="page"/>
+      </w:r>
+    </w:p>
+    <w:p>
+      <w:pPr>
+        <w:pStyle w:val="CaptionedFigure"/>
+      </w:pPr>
+      <w:r>
+        <w:drawing>
+          <wp:inline>
+            <wp:extent cx="5334000" cy="1752600"/>
+            <wp:effectExtent b="0" l="0" r="0" t="0"/>
+            <wp:docPr descr="Figure A.7" title="" id="94" name="Picture"/>
+            <a:graphic>
+              <a:graphicData uri="http://schemas.openxmlformats.org/drawingml/2006/picture">
+                <pic:pic>
+                  <pic:nvPicPr>
+                    <pic:cNvPr descr="screenshots/07-consensus-simulator.png" id="95" name="Picture"/>
+                    <pic:cNvPicPr>
+                      <a:picLocks noChangeArrowheads="1" noChangeAspect="1"/>
+                    </pic:cNvPicPr>
+                  </pic:nvPicPr>
+                  <pic:blipFill>
+                    <a:blip r:embed="rId93"/>
+                    <a:stretch>
+                      <a:fillRect/>
+                    </a:stretch>
+                  </pic:blipFill>
+                  <pic:spPr bwMode="auto">
+                    <a:xfrm>
+                      <a:off x="0" y="0"/>
+                      <a:ext cx="5334000" cy="1752600"/>
+                    </a:xfrm>
+                    <a:prstGeom prst="rect">
+                      <a:avLst/>
+                    </a:prstGeom>
+                    <a:noFill/>
+                    <a:ln w="9525">
+                      <a:noFill/>
+                      <a:headEnd/>
+                      <a:tailEnd/>
+                    </a:ln>
+                  </pic:spPr>
+                </pic:pic>
+              </a:graphicData>
+            </a:graphic>
+          </wp:inline>
+        </w:drawing>
+      </w:r>
+    </w:p>
+    <w:p>
+      <w:pPr>
+        <w:pStyle w:val="ImageCaption"/>
+      </w:pPr>
+      <w:r>
+        <w:t xml:space="preserve">Figure A.7</w:t>
+      </w:r>
+    </w:p>
+    <w:p>
+      <w:pPr>
+        <w:pStyle w:val="FirstParagraph"/>
+      </w:pPr>
+      <w:r>
+        <w:rPr>
+          <w:i/>
+          <w:iCs/>
+        </w:rPr>
+        <w:t xml:space="preserve">Figure A.7 — Consensus simulator with one source corrupted (NASA POWER inflated ×2.5) (</w:t>
+      </w:r>
+      <w:r>
+        <w:rPr>
+          <w:rStyle w:val="VerbatimChar"/>
+          <w:i/>
+          <w:iCs/>
+        </w:rPr>
+        <w:t xml:space="preserve">07-consensus-simulator.png</w:t>
+      </w:r>
+      <w:r>
+        <w:rPr>
+          <w:i/>
+          <w:iCs/>
+        </w:rPr>
+        <w:t xml:space="preserve">)</w:t>
+      </w:r>
+    </w:p>
+    <w:p>
+      <w:r>
+        <w:br w:type="page"/>
+      </w:r>
+    </w:p>
+    <w:p>
+      <w:pPr>
+        <w:pStyle w:val="CaptionedFigure"/>
+      </w:pPr>
+      <w:r>
+        <w:drawing>
+          <wp:inline>
+            <wp:extent cx="4581144" cy="7498080"/>
+            <wp:effectExtent b="0" l="0" r="0" t="0"/>
+            <wp:docPr descr="Figure A.8" title="" id="97" name="Picture"/>
+            <a:graphic>
+              <a:graphicData uri="http://schemas.openxmlformats.org/drawingml/2006/picture">
+                <pic:pic>
+                  <pic:nvPicPr>
+                    <pic:cNvPr descr="screenshots/08-backtest.png" id="98" name="Picture"/>
+                    <pic:cNvPicPr>
+                      <a:picLocks noChangeArrowheads="1" noChangeAspect="1"/>
+                    </pic:cNvPicPr>
+                  </pic:nvPicPr>
+                  <pic:blipFill>
+                    <a:blip r:embed="rId96"/>
+                    <a:stretch>
+                      <a:fillRect/>
+                    </a:stretch>
+                  </pic:blipFill>
+                  <pic:spPr bwMode="auto">
+                    <a:xfrm>
+                      <a:off x="0" y="0"/>
+                      <a:ext cx="4581144" cy="7498080"/>
+                    </a:xfrm>
+                    <a:prstGeom prst="rect">
+                      <a:avLst/>
+                    </a:prstGeom>
+                    <a:noFill/>
+                    <a:ln w="9525">
+                      <a:noFill/>
+                      <a:headEnd/>
+                      <a:tailEnd/>
+                    </a:ln>
+                  </pic:spPr>
+                </pic:pic>
+              </a:graphicData>
+            </a:graphic>
+          </wp:inline>
+        </w:drawing>
+      </w:r>
+    </w:p>
+    <w:p>
+      <w:pPr>
+        <w:pStyle w:val="ImageCaption"/>
+      </w:pPr>
+      <w:r>
+        <w:t xml:space="preserve">Figure A.8</w:t>
+      </w:r>
+    </w:p>
+    <w:p>
+      <w:pPr>
+        <w:pStyle w:val="FirstParagraph"/>
+      </w:pPr>
+      <w:r>
+        <w:rPr>
+          <w:i/>
+          <w:iCs/>
+        </w:rPr>
+        <w:t xml:space="preserve">Figure A.8 — Backtest of aggregation designs against historical rainfall (</w:t>
+      </w:r>
+      <w:r>
+        <w:rPr>
+          <w:rStyle w:val="VerbatimChar"/>
+          <w:i/>
+          <w:iCs/>
+        </w:rPr>
+        <w:t xml:space="preserve">08-backtest.png</w:t>
+      </w:r>
+      <w:r>
+        <w:rPr>
+          <w:i/>
+          <w:iCs/>
+        </w:rPr>
+        <w:t xml:space="preserve">)</w:t>
+      </w:r>
+    </w:p>
+    <w:p>
+      <w:r>
+        <w:br w:type="page"/>
+      </w:r>
+    </w:p>
+    <w:p>
+      <w:pPr>
+        <w:pStyle w:val="CaptionedFigure"/>
+      </w:pPr>
+      <w:r>
+        <w:drawing>
+          <wp:inline>
+            <wp:extent cx="3465576" cy="7498080"/>
+            <wp:effectExtent b="0" l="0" r="0" t="0"/>
+            <wp:docPr descr="Figure A.9" title="" id="100" name="Picture"/>
+            <a:graphic>
+              <a:graphicData uri="http://schemas.openxmlformats.org/drawingml/2006/picture">
+                <pic:pic>
+                  <pic:nvPicPr>
+                    <pic:cNvPr descr="screenshots/09-mobile.png" id="101" name="Picture"/>
+                    <pic:cNvPicPr>
+                      <a:picLocks noChangeArrowheads="1" noChangeAspect="1"/>
+                    </pic:cNvPicPr>
+                  </pic:nvPicPr>
+                  <pic:blipFill>
+                    <a:blip r:embed="rId99"/>
+                    <a:stretch>
+                      <a:fillRect/>
+                    </a:stretch>
+                  </pic:blipFill>
+                  <pic:spPr bwMode="auto">
+                    <a:xfrm>
+                      <a:off x="0" y="0"/>
+                      <a:ext cx="3465576" cy="7498080"/>
+                    </a:xfrm>
+                    <a:prstGeom prst="rect">
+                      <a:avLst/>
+                    </a:prstGeom>
+                    <a:noFill/>
+                    <a:ln w="9525">
+                      <a:noFill/>
+                      <a:headEnd/>
+                      <a:tailEnd/>
+                    </a:ln>
+                  </pic:spPr>
+                </pic:pic>
+              </a:graphicData>
+            </a:graphic>
+          </wp:inline>
+        </w:drawing>
+      </w:r>
+    </w:p>
+    <w:p>
+      <w:pPr>
+        <w:pStyle w:val="ImageCaption"/>
+      </w:pPr>
+      <w:r>
+        <w:t xml:space="preserve">Figure A.9</w:t>
+      </w:r>
+    </w:p>
+    <w:p>
+      <w:pPr>
+        <w:pStyle w:val="FirstParagraph"/>
+      </w:pPr>
+      <w:r>
+        <w:rPr>
+          <w:i/>
+          <w:iCs/>
+        </w:rPr>
+        <w:t xml:space="preserve">Figure A.9 — Mobile layout of the farmer dashboard (</w:t>
+      </w:r>
+      <w:r>
+        <w:rPr>
+          <w:rStyle w:val="VerbatimChar"/>
+          <w:i/>
+          <w:iCs/>
+        </w:rPr>
+        <w:t xml:space="preserve">09-mobile.png</w:t>
+      </w:r>
+      <w:r>
+        <w:rPr>
+          <w:i/>
+          <w:iCs/>
+        </w:rPr>
+        <w:t xml:space="preserve">)</w:t>
+      </w:r>
+    </w:p>
+    <w:p>
+      <w:r>
+        <w:br w:type="page"/>
+      </w:r>
+    </w:p>
+    <w:p>
+      <w:pPr>
+        <w:pStyle w:val="CaptionedFigure"/>
+      </w:pPr>
+      <w:r>
+        <w:drawing>
+          <wp:inline>
+            <wp:extent cx="5334000" cy="4766733"/>
+            <wp:effectExtent b="0" l="0" r="0" t="0"/>
+            <wp:docPr descr="Figure A.10" title="" id="103" name="Picture"/>
+            <a:graphic>
+              <a:graphicData uri="http://schemas.openxmlformats.org/drawingml/2006/picture">
+                <pic:pic>
+                  <pic:nvPicPr>
+                    <pic:cNvPr descr="screenshots/10-tests.png" id="104" name="Picture"/>
+                    <pic:cNvPicPr>
+                      <a:picLocks noChangeArrowheads="1" noChangeAspect="1"/>
+                    </pic:cNvPicPr>
+                  </pic:nvPicPr>
+                  <pic:blipFill>
+                    <a:blip r:embed="rId102"/>
+                    <a:stretch>
+                      <a:fillRect/>
+                    </a:stretch>
+                  </pic:blipFill>
+                  <pic:spPr bwMode="auto">
+                    <a:xfrm>
+                      <a:off x="0" y="0"/>
+                      <a:ext cx="5334000" cy="4766733"/>
+                    </a:xfrm>
+                    <a:prstGeom prst="rect">
+                      <a:avLst/>
+                    </a:prstGeom>
+                    <a:noFill/>
+                    <a:ln w="9525">
+                      <a:noFill/>
+                      <a:headEnd/>
+                      <a:tailEnd/>
+                    </a:ln>
+                  </pic:spPr>
+                </pic:pic>
+              </a:graphicData>
+            </a:graphic>
+          </wp:inline>
+        </w:drawing>
+      </w:r>
+    </w:p>
+    <w:p>
+      <w:pPr>
+        <w:pStyle w:val="ImageCaption"/>
+      </w:pPr>
+      <w:r>
+        <w:t xml:space="preserve">Figure A.10</w:t>
+      </w:r>
+    </w:p>
+    <w:p>
+      <w:pPr>
+        <w:pStyle w:val="FirstParagraph"/>
+      </w:pPr>
+      <w:r>
+        <w:rPr>
+          <w:i/>
+          <w:iCs/>
+        </w:rPr>
+        <w:t xml:space="preserve">Figure A.10 —</w:t>
+      </w:r>
+      <w:r>
+        <w:rPr>
+          <w:i/>
+          <w:iCs/>
+        </w:rPr>
+        <w:t xml:space="preserve"> </w:t>
+      </w:r>
+      <w:r>
+        <w:rPr>
+          <w:rStyle w:val="VerbatimChar"/>
+          <w:i/>
+          <w:iCs/>
+        </w:rPr>
+        <w:t xml:space="preserve">npm run test</w:t>
+      </w:r>
+      <w:r>
+        <w:rPr>
+          <w:i/>
+          <w:iCs/>
+        </w:rPr>
+        <w:t xml:space="preserve"> </w:t>
+      </w:r>
+      <w:r>
+        <w:rPr>
+          <w:i/>
+          <w:iCs/>
+        </w:rPr>
+        <w:t xml:space="preserve">— 69 passing (56 Solidity, 13 Mocha) in the blockchain workspace (</w:t>
+      </w:r>
+      <w:r>
+        <w:rPr>
+          <w:rStyle w:val="VerbatimChar"/>
+          <w:i/>
+          <w:iCs/>
+        </w:rPr>
+        <w:t xml:space="preserve">10-tests.png</w:t>
+      </w:r>
+      <w:r>
+        <w:rPr>
+          <w:i/>
+          <w:iCs/>
+        </w:rPr>
+        <w:t xml:space="preserve">)</w:t>
+      </w:r>
+    </w:p>
+    <w:p>
+      <w:pPr>
+        <w:pStyle w:val="BodyText"/>
+      </w:pPr>
+      <w:r>
         <w:t xml:space="preserve">Figures 4.1–4.3 are rendered in</w:t>
       </w:r>
       <w:r>
@@ -9137,11 +9718,11 @@
       <w:pPr>
         <w:pStyle w:val="Heading2"/>
       </w:pPr>
-      <w:bookmarkStart w:id="75" w:name="_b48c70b2895ac09f72087c4ee650c33adc550a6"/>
+      <w:bookmarkStart w:id="105" w:name="_b48c70b2895ac09f72087c4ee650c33adc550a6"/>
       <w:r>
         <w:t xml:space="preserve">Appendix B: Endpoints</w:t>
       </w:r>
-      <w:bookmarkEnd w:id="75"/>
+      <w:bookmarkEnd w:id="105"/>
     </w:p>
     <w:p>
       <w:pPr>
@@ -9874,11 +10455,11 @@
       <w:pPr>
         <w:pStyle w:val="Heading2"/>
       </w:pPr>
-      <w:bookmarkStart w:id="76" w:name="_c75ea5f7737866a933d1e3ad66928a4a4ef9d44"/>
+      <w:bookmarkStart w:id="106" w:name="_c75ea5f7737866a933d1e3ad66928a4a4ef9d44"/>
       <w:r>
         <w:t xml:space="preserve">Appendix C: Debugging journal (summary)</w:t>
       </w:r>
-      <w:bookmarkEnd w:id="76"/>
+      <w:bookmarkEnd w:id="106"/>
     </w:p>
     <w:p>
       <w:pPr>
@@ -9985,11 +10566,11 @@
       <w:pPr>
         <w:pStyle w:val="Heading2"/>
       </w:pPr>
-      <w:bookmarkStart w:id="77" w:name="_f985d0ad14091e4a45016a3cbe64ff6c3d758bd"/>
+      <w:bookmarkStart w:id="107" w:name="_f985d0ad14091e4a45016a3cbe64ff6c3d758bd"/>
       <w:r>
         <w:t xml:space="preserve">Appendix D: Licences</w:t>
       </w:r>
-      <w:bookmarkEnd w:id="77"/>
+      <w:bookmarkEnd w:id="107"/>
     </w:p>
     <w:p>
       <w:pPr>

</xml_diff>

<commit_message>
docs: update figures in the report for improved clarity and adjust dimensions
</commit_message>
<xml_diff>
--- a/docs/report.docx
+++ b/docs/report.docx
@@ -9374,7 +9374,7 @@
       <w:r>
         <w:drawing>
           <wp:inline>
-            <wp:extent cx="4581144" cy="7498080"/>
+            <wp:extent cx="4242816" cy="6949439"/>
             <wp:effectExtent b="0" l="0" r="0" t="0"/>
             <wp:docPr descr="Figure A.8" title="" id="97" name="Picture"/>
             <a:graphic>
@@ -9395,7 +9395,7 @@
                   <pic:spPr bwMode="auto">
                     <a:xfrm>
                       <a:off x="0" y="0"/>
-                      <a:ext cx="4581144" cy="7498080"/>
+                      <a:ext cx="4242816" cy="6949439"/>
                     </a:xfrm>
                     <a:prstGeom prst="rect">
                       <a:avLst/>
@@ -9461,7 +9461,7 @@
       <w:r>
         <w:drawing>
           <wp:inline>
-            <wp:extent cx="3465576" cy="7498080"/>
+            <wp:extent cx="3209543" cy="6949439"/>
             <wp:effectExtent b="0" l="0" r="0" t="0"/>
             <wp:docPr descr="Figure A.9" title="" id="100" name="Picture"/>
             <a:graphic>
@@ -9482,7 +9482,7 @@
                   <pic:spPr bwMode="auto">
                     <a:xfrm>
                       <a:off x="0" y="0"/>
-                      <a:ext cx="3465576" cy="7498080"/>
+                      <a:ext cx="3209543" cy="6949439"/>
                     </a:xfrm>
                     <a:prstGeom prst="rect">
                       <a:avLst/>

</xml_diff>